<commit_message>
Faith: fix front-matter page numbers (i, ii, iii…), align TOC with actual pages, trim references to 10
</commit_message>
<xml_diff>
--- a/files/Faith_Okumu_Research_Project.docx
+++ b/files/Faith_Okumu_Research_Project.docx
@@ -737,7 +737,7 @@
           <w:sz w:val="22"/>
         </w:rPr>
         <w:tab/>
-        <w:t>vi</w:t>
+        <w:t>vii</w:t>
       </w:r>
     </w:p>
     <w:p>
@@ -926,7 +926,7 @@
           <w:sz w:val="22"/>
         </w:rPr>
         <w:tab/>
-        <w:t>5</w:t>
+        <w:t>4</w:t>
       </w:r>
     </w:p>
     <w:p>
@@ -953,7 +953,7 @@
           <w:sz w:val="22"/>
         </w:rPr>
         <w:tab/>
-        <w:t>5</w:t>
+        <w:t>4</w:t>
       </w:r>
     </w:p>
     <w:p>
@@ -980,7 +980,7 @@
           <w:sz w:val="22"/>
         </w:rPr>
         <w:tab/>
-        <w:t>6</w:t>
+        <w:t>5</w:t>
       </w:r>
     </w:p>
     <w:p>
@@ -1007,7 +1007,7 @@
           <w:sz w:val="22"/>
         </w:rPr>
         <w:tab/>
-        <w:t>6</w:t>
+        <w:t>5</w:t>
       </w:r>
     </w:p>
     <w:p>
@@ -1034,7 +1034,7 @@
           <w:sz w:val="22"/>
         </w:rPr>
         <w:tab/>
-        <w:t>7</w:t>
+        <w:t>6</w:t>
       </w:r>
     </w:p>
     <w:p>
@@ -1061,7 +1061,7 @@
           <w:sz w:val="22"/>
         </w:rPr>
         <w:tab/>
-        <w:t>8</w:t>
+        <w:t>7</w:t>
       </w:r>
     </w:p>
     <w:p>
@@ -1088,7 +1088,7 @@
           <w:sz w:val="22"/>
         </w:rPr>
         <w:tab/>
-        <w:t>8</w:t>
+        <w:t>7</w:t>
       </w:r>
     </w:p>
     <w:p>
@@ -1115,7 +1115,7 @@
           <w:sz w:val="22"/>
         </w:rPr>
         <w:tab/>
-        <w:t>10</w:t>
+        <w:t>8</w:t>
       </w:r>
     </w:p>
     <w:p>
@@ -1142,7 +1142,7 @@
           <w:sz w:val="22"/>
         </w:rPr>
         <w:tab/>
-        <w:t>10</w:t>
+        <w:t>8</w:t>
       </w:r>
     </w:p>
     <w:p>
@@ -1169,7 +1169,7 @@
           <w:sz w:val="22"/>
         </w:rPr>
         <w:tab/>
-        <w:t>10</w:t>
+        <w:t>8</w:t>
       </w:r>
     </w:p>
     <w:p>
@@ -1196,7 +1196,7 @@
           <w:sz w:val="22"/>
         </w:rPr>
         <w:tab/>
-        <w:t>13</w:t>
+        <w:t>9</w:t>
       </w:r>
     </w:p>
     <w:p>
@@ -1223,7 +1223,7 @@
           <w:sz w:val="22"/>
         </w:rPr>
         <w:tab/>
-        <w:t>17</w:t>
+        <w:t>12</w:t>
       </w:r>
     </w:p>
     <w:p>
@@ -1250,7 +1250,7 @@
           <w:sz w:val="22"/>
         </w:rPr>
         <w:tab/>
-        <w:t>20</w:t>
+        <w:t>14</w:t>
       </w:r>
     </w:p>
     <w:p>
@@ -1277,7 +1277,7 @@
           <w:sz w:val="22"/>
         </w:rPr>
         <w:tab/>
-        <w:t>22</w:t>
+        <w:t>15</w:t>
       </w:r>
     </w:p>
     <w:p>
@@ -1304,7 +1304,7 @@
           <w:sz w:val="22"/>
         </w:rPr>
         <w:tab/>
-        <w:t>22</w:t>
+        <w:t>15</w:t>
       </w:r>
     </w:p>
     <w:p>
@@ -1331,7 +1331,7 @@
           <w:sz w:val="22"/>
         </w:rPr>
         <w:tab/>
-        <w:t>22</w:t>
+        <w:t>16</w:t>
       </w:r>
     </w:p>
     <w:p>
@@ -1358,7 +1358,7 @@
           <w:sz w:val="22"/>
         </w:rPr>
         <w:tab/>
-        <w:t>22</w:t>
+        <w:t>16</w:t>
       </w:r>
     </w:p>
     <w:p>
@@ -1385,7 +1385,7 @@
           <w:sz w:val="22"/>
         </w:rPr>
         <w:tab/>
-        <w:t>23</w:t>
+        <w:t>16</w:t>
       </w:r>
     </w:p>
     <w:p>
@@ -1412,7 +1412,7 @@
           <w:sz w:val="22"/>
         </w:rPr>
         <w:tab/>
-        <w:t>23</w:t>
+        <w:t>17</w:t>
       </w:r>
     </w:p>
     <w:p>
@@ -1439,7 +1439,7 @@
           <w:sz w:val="22"/>
         </w:rPr>
         <w:tab/>
-        <w:t>24</w:t>
+        <w:t>17</w:t>
       </w:r>
     </w:p>
     <w:p>
@@ -1466,7 +1466,7 @@
           <w:sz w:val="22"/>
         </w:rPr>
         <w:tab/>
-        <w:t>25</w:t>
+        <w:t>18</w:t>
       </w:r>
     </w:p>
     <w:p>
@@ -1493,7 +1493,7 @@
           <w:sz w:val="22"/>
         </w:rPr>
         <w:tab/>
-        <w:t>26</w:t>
+        <w:t>18</w:t>
       </w:r>
     </w:p>
     <w:p>
@@ -1520,7 +1520,7 @@
           <w:sz w:val="22"/>
         </w:rPr>
         <w:tab/>
-        <w:t>27</w:t>
+        <w:t>19</w:t>
       </w:r>
     </w:p>
     <w:p>
@@ -1547,7 +1547,7 @@
           <w:sz w:val="22"/>
         </w:rPr>
         <w:tab/>
-        <w:t>28</w:t>
+        <w:t>20</w:t>
       </w:r>
     </w:p>
     <w:p>
@@ -1574,7 +1574,7 @@
           <w:sz w:val="22"/>
         </w:rPr>
         <w:tab/>
-        <w:t>28</w:t>
+        <w:t>20</w:t>
       </w:r>
     </w:p>
     <w:p>
@@ -1601,7 +1601,7 @@
           <w:sz w:val="22"/>
         </w:rPr>
         <w:tab/>
-        <w:t>28</w:t>
+        <w:t>20</w:t>
       </w:r>
     </w:p>
     <w:p>
@@ -1628,7 +1628,7 @@
           <w:sz w:val="22"/>
         </w:rPr>
         <w:tab/>
-        <w:t>30</w:t>
+        <w:t>21</w:t>
       </w:r>
     </w:p>
     <w:p>
@@ -1655,7 +1655,7 @@
           <w:sz w:val="22"/>
         </w:rPr>
         <w:tab/>
-        <w:t>32</w:t>
+        <w:t>23</w:t>
       </w:r>
     </w:p>
     <w:p>
@@ -1682,7 +1682,7 @@
           <w:sz w:val="22"/>
         </w:rPr>
         <w:tab/>
-        <w:t>33</w:t>
+        <w:t>24</w:t>
       </w:r>
     </w:p>
     <w:p>
@@ -1709,7 +1709,7 @@
           <w:sz w:val="22"/>
         </w:rPr>
         <w:tab/>
-        <w:t>40</w:t>
+        <w:t>31</w:t>
       </w:r>
     </w:p>
     <w:p>
@@ -1736,7 +1736,7 @@
           <w:sz w:val="22"/>
         </w:rPr>
         <w:tab/>
-        <w:t>40</w:t>
+        <w:t>31</w:t>
       </w:r>
     </w:p>
     <w:p>
@@ -1763,7 +1763,7 @@
           <w:sz w:val="22"/>
         </w:rPr>
         <w:tab/>
-        <w:t>40</w:t>
+        <w:t>31</w:t>
       </w:r>
     </w:p>
     <w:p>
@@ -1790,7 +1790,7 @@
           <w:sz w:val="22"/>
         </w:rPr>
         <w:tab/>
-        <w:t>43</w:t>
+        <w:t>32</w:t>
       </w:r>
     </w:p>
     <w:p>
@@ -1817,7 +1817,7 @@
           <w:sz w:val="22"/>
         </w:rPr>
         <w:tab/>
-        <w:t>44</w:t>
+        <w:t>33</w:t>
       </w:r>
     </w:p>
     <w:p>
@@ -1844,7 +1844,7 @@
           <w:sz w:val="22"/>
         </w:rPr>
         <w:tab/>
-        <w:t>45</w:t>
+        <w:t>34</w:t>
       </w:r>
     </w:p>
     <w:p>
@@ -1871,7 +1871,7 @@
           <w:sz w:val="22"/>
         </w:rPr>
         <w:tab/>
-        <w:t>46</w:t>
+        <w:t>35</w:t>
       </w:r>
     </w:p>
     <w:p>
@@ -1898,7 +1898,7 @@
           <w:sz w:val="22"/>
         </w:rPr>
         <w:tab/>
-        <w:t>49</w:t>
+        <w:t>37</w:t>
       </w:r>
     </w:p>
     <w:p>
@@ -1925,7 +1925,7 @@
           <w:sz w:val="22"/>
         </w:rPr>
         <w:tab/>
-        <w:t>49</w:t>
+        <w:t>37</w:t>
       </w:r>
     </w:p>
     <w:p>
@@ -1952,7 +1952,7 @@
           <w:sz w:val="22"/>
         </w:rPr>
         <w:tab/>
-        <w:t>50</w:t>
+        <w:t>37</w:t>
       </w:r>
       <w:r>
         <w:br w:type="page"/>
@@ -1996,7 +1996,7 @@
           <w:sz w:val="22"/>
         </w:rPr>
         <w:tab/>
-        <w:t>20</w:t>
+        <w:t>14</w:t>
       </w:r>
     </w:p>
     <w:p>
@@ -2023,7 +2023,7 @@
           <w:sz w:val="22"/>
         </w:rPr>
         <w:tab/>
-        <w:t>23</w:t>
+        <w:t>17</w:t>
       </w:r>
     </w:p>
     <w:p>
@@ -2050,7 +2050,7 @@
           <w:sz w:val="22"/>
         </w:rPr>
         <w:tab/>
-        <w:t>27</w:t>
+        <w:t>18</w:t>
       </w:r>
     </w:p>
     <w:p>
@@ -2077,7 +2077,7 @@
           <w:sz w:val="22"/>
         </w:rPr>
         <w:tab/>
-        <w:t>28</w:t>
+        <w:t>20</w:t>
       </w:r>
     </w:p>
     <w:p>
@@ -2104,7 +2104,7 @@
           <w:sz w:val="22"/>
         </w:rPr>
         <w:tab/>
-        <w:t>30</w:t>
+        <w:t>22</w:t>
       </w:r>
     </w:p>
     <w:p>
@@ -2131,7 +2131,7 @@
           <w:sz w:val="22"/>
         </w:rPr>
         <w:tab/>
-        <w:t>31</w:t>
+        <w:t>22</w:t>
       </w:r>
     </w:p>
     <w:p>
@@ -2158,7 +2158,7 @@
           <w:sz w:val="22"/>
         </w:rPr>
         <w:tab/>
-        <w:t>31</w:t>
+        <w:t>23</w:t>
       </w:r>
     </w:p>
     <w:p>
@@ -2185,7 +2185,7 @@
           <w:sz w:val="22"/>
         </w:rPr>
         <w:tab/>
-        <w:t>32</w:t>
+        <w:t>23</w:t>
       </w:r>
     </w:p>
     <w:p>
@@ -2212,7 +2212,7 @@
           <w:sz w:val="22"/>
         </w:rPr>
         <w:tab/>
-        <w:t>32</w:t>
+        <w:t>24</w:t>
       </w:r>
     </w:p>
     <w:p>
@@ -2239,7 +2239,7 @@
           <w:sz w:val="22"/>
         </w:rPr>
         <w:tab/>
-        <w:t>33</w:t>
+        <w:t>25</w:t>
       </w:r>
     </w:p>
     <w:p>
@@ -2266,7 +2266,7 @@
           <w:sz w:val="22"/>
         </w:rPr>
         <w:tab/>
-        <w:t>34</w:t>
+        <w:t>26</w:t>
       </w:r>
     </w:p>
     <w:p>
@@ -2293,7 +2293,7 @@
           <w:sz w:val="22"/>
         </w:rPr>
         <w:tab/>
-        <w:t>35</w:t>
+        <w:t>26</w:t>
       </w:r>
     </w:p>
     <w:p>
@@ -2320,7 +2320,7 @@
           <w:sz w:val="22"/>
         </w:rPr>
         <w:tab/>
-        <w:t>36</w:t>
+        <w:t>27</w:t>
       </w:r>
     </w:p>
     <w:p>
@@ -2347,7 +2347,7 @@
           <w:sz w:val="22"/>
         </w:rPr>
         <w:tab/>
-        <w:t>37</w:t>
+        <w:t>28</w:t>
       </w:r>
     </w:p>
     <w:p>
@@ -2374,7 +2374,7 @@
           <w:sz w:val="22"/>
         </w:rPr>
         <w:tab/>
-        <w:t>38</w:t>
+        <w:t>29</w:t>
       </w:r>
     </w:p>
     <w:p>
@@ -2401,7 +2401,7 @@
           <w:sz w:val="22"/>
         </w:rPr>
         <w:tab/>
-        <w:t>49</w:t>
+        <w:t>37</w:t>
       </w:r>
     </w:p>
     <w:p>
@@ -2428,7 +2428,7 @@
           <w:sz w:val="22"/>
         </w:rPr>
         <w:tab/>
-        <w:t>50</w:t>
+        <w:t>37</w:t>
       </w:r>
       <w:r>
         <w:br w:type="page"/>
@@ -2463,7 +2463,7 @@
           <w:b w:val="0"/>
           <w:sz w:val="22"/>
         </w:rPr>
-        <w:t>Figure 2.1: Conceptual Framework</w:t>
+        <w:t>Figure 1.1: Conceptual Framework</w:t>
       </w:r>
       <w:r>
         <w:rPr>
@@ -2472,7 +2472,7 @@
           <w:sz w:val="22"/>
         </w:rPr>
         <w:tab/>
-        <w:t>17</w:t>
+        <w:t>12</w:t>
       </w:r>
       <w:r>
         <w:br w:type="page"/>
@@ -2904,7 +2904,7 @@
       <w:pPr>
         <w:sectPr>
           <w:type w:val="nextPage"/>
-          <w:pgNumType w:fmt="decimal" w:start="1"/>
+          <w:pgNumType w:fmt="lowerRoman" w:start="2"/>
         </w:sectPr>
       </w:pPr>
     </w:p>
@@ -15599,7 +15599,7 @@
           <w:rFonts w:ascii="Times New Roman" w:hAnsi="Times New Roman"/>
           <w:sz w:val="24"/>
         </w:rPr>
-        <w:t>Akpey, I., &amp; Azembila, A. B. (2016). The effect of audit committees on the performance of firms listed on the Ghana Stock Exchange. Journal of Business and Management, 18(11), 55–62.</w:t>
+        <w:t>Al-Jalahma, A. (2022). Impact of audit committee characteristics on firm performance: Evidence from Bahrain. Problems and Perspectives in Management, 20(1), 247–261.</w:t>
       </w:r>
     </w:p>
     <w:p>
@@ -15613,7 +15613,7 @@
           <w:rFonts w:ascii="Times New Roman" w:hAnsi="Times New Roman"/>
           <w:sz w:val="24"/>
         </w:rPr>
-        <w:t>Al-Jalahma, A. (2022). Impact of audit committee characteristics on firm performance: Evidence from Bahrain. Problems and Perspectives in Management, 20(1), 247–261.</w:t>
+        <w:t>Capital Markets Authority. (2021). The code of corporate governance practices for issuers of securities to the public. Nairobi: CMA.</w:t>
       </w:r>
     </w:p>
     <w:p>
@@ -15627,7 +15627,7 @@
           <w:rFonts w:ascii="Times New Roman" w:hAnsi="Times New Roman"/>
           <w:sz w:val="24"/>
         </w:rPr>
-        <w:t>Al-Jaifi, H. A. (2020). Board gender diversity and environmental, social and corporate governance performance: Evidence from ASEAN banks. Asia-Pacific Journal of Business Administration, 12(3), 269–281.</w:t>
+        <w:t>Central Bank of Kenya. (2024). Bank supervision annual report. Nairobi: Central Bank of Kenya.</w:t>
       </w:r>
     </w:p>
     <w:p>
@@ -15641,7 +15641,7 @@
           <w:rFonts w:ascii="Times New Roman" w:hAnsi="Times New Roman"/>
           <w:sz w:val="24"/>
         </w:rPr>
-        <w:t>Al-Okaily, J., &amp; Naueihed, S. (2020). Audit committee effectiveness and family firms: Impact on performance. Management Decision, 58(6), 1021–1034.</w:t>
+        <w:t>Donaldson, L., &amp; Davis, J. H. (1991). Stewardship theory or agency theory: CEO governance and shareholder returns. Australian Journal of Management, 16(1), 49–64.</w:t>
       </w:r>
     </w:p>
     <w:p>
@@ -15655,7 +15655,7 @@
           <w:rFonts w:ascii="Times New Roman" w:hAnsi="Times New Roman"/>
           <w:sz w:val="24"/>
         </w:rPr>
-        <w:t>Al Farooque, O., Buachoom, W., &amp; Hoang, N. (2020). Interactive effects of executive compensation, firm performance and corporate governance: Evidence from an Asian market. Asia Pacific Journal of Management, 36(4), 1111–1164.</w:t>
+        <w:t>Jensen, M. C., &amp; Meckling, W. H. (1976). Theory of the firm: Managerial behaviour, agency costs and ownership structure. Journal of Financial Economics, 3(4), 305–360.</w:t>
       </w:r>
     </w:p>
     <w:p>
@@ -15669,7 +15669,7 @@
           <w:rFonts w:ascii="Times New Roman" w:hAnsi="Times New Roman"/>
           <w:sz w:val="24"/>
         </w:rPr>
-        <w:t>Ashari, S., &amp; Krismiaji, K. (2020). Audit committee characteristics and financial performance: Indonesian evidence. Equity, 22(2), 139–152.</w:t>
+        <w:t>Kallamu, B. S., &amp; Saat, N. A. M. (2015). Audit committee attributes and firm performance: Evidence from Malaysian finance companies. Asian Review of Accounting, 23(3), 206–231.</w:t>
       </w:r>
     </w:p>
     <w:p>
@@ -15683,7 +15683,7 @@
           <w:rFonts w:ascii="Times New Roman" w:hAnsi="Times New Roman"/>
           <w:sz w:val="24"/>
         </w:rPr>
-        <w:t>Baiden, F. (2022). Audit committee characteristics and the financial performance of banks in Ghana. African Journal of Accounting, Auditing and Finance, 8(1), 65–85.</w:t>
+        <w:t>Kipkoech, S. K., &amp; Rono, L. (2016). Audit committee size, experience and firm financial performance: Evidence from Nairobi Securities Exchange. Research Journal of Finance and Accounting, 7(15), 87–95.</w:t>
       </w:r>
     </w:p>
     <w:p>
@@ -15697,7 +15697,7 @@
           <w:rFonts w:ascii="Times New Roman" w:hAnsi="Times New Roman"/>
           <w:sz w:val="24"/>
         </w:rPr>
-        <w:t>Balagobei, S., &amp; Velnampy, T. (2018). Impact of audit committee on organizational performance of listed hotels and travels in Sri Lanka. International Journal of Accounting and Financial Reporting, 8(4), 351–368.</w:t>
+        <w:t>Mohamed, A. M., &amp; Mwengei, K. B. O. (2019). Influence of audit committee independence on firm value of listed firms in Kenya. International Journal of Economics, Commerce and Management, 7(4), 462–478.</w:t>
       </w:r>
     </w:p>
     <w:p>
@@ -15711,7 +15711,7 @@
           <w:rFonts w:ascii="Times New Roman" w:hAnsi="Times New Roman"/>
           <w:sz w:val="24"/>
         </w:rPr>
-        <w:t>Basel Committee on Banking Supervision. (2021). Principles for the sound management of operational risk and the role of supervision. Bank for International Settlements.</w:t>
+        <w:t>OECD. (2020). OECD principles of corporate governance. Paris: Organisation for Economic Co-operation and Development.</w:t>
       </w:r>
     </w:p>
     <w:p>
@@ -15725,525 +15725,7 @@
           <w:rFonts w:ascii="Times New Roman" w:hAnsi="Times New Roman"/>
           <w:sz w:val="24"/>
         </w:rPr>
-        <w:t>Bouaine, W., &amp; Hrichi, Y. (2019). Impact of audit committee adoption and its characteristics on financial performance: Evidence from 100 French companies. Accounting and Finance Research, 8(1), 92–102.</w:t>
-      </w:r>
-    </w:p>
-    <w:p>
-      <w:pPr>
-        <w:spacing w:after="120" w:line="360" w:lineRule="auto"/>
-        <w:ind w:left="576" w:hanging="576"/>
-        <w:jc w:val="both"/>
-      </w:pPr>
-      <w:r>
-        <w:rPr>
-          <w:rFonts w:ascii="Times New Roman" w:hAnsi="Times New Roman"/>
-          <w:sz w:val="24"/>
-        </w:rPr>
-        <w:t>Capital Markets Authority. (2021). The code of corporate governance practices for issuers of securities to the public. Nairobi: CMA.</w:t>
-      </w:r>
-    </w:p>
-    <w:p>
-      <w:pPr>
-        <w:spacing w:after="120" w:line="360" w:lineRule="auto"/>
-        <w:ind w:left="576" w:hanging="576"/>
-        <w:jc w:val="both"/>
-      </w:pPr>
-      <w:r>
-        <w:rPr>
-          <w:rFonts w:ascii="Times New Roman" w:hAnsi="Times New Roman"/>
-          <w:sz w:val="24"/>
-        </w:rPr>
-        <w:t>Capital Markets Authority Uganda. (2022). Corporate governance guidelines for capital market issuers. Kampala: CMA Uganda.</w:t>
-      </w:r>
-    </w:p>
-    <w:p>
-      <w:pPr>
-        <w:spacing w:after="120" w:line="360" w:lineRule="auto"/>
-        <w:ind w:left="576" w:hanging="576"/>
-        <w:jc w:val="both"/>
-      </w:pPr>
-      <w:r>
-        <w:rPr>
-          <w:rFonts w:ascii="Times New Roman" w:hAnsi="Times New Roman"/>
-          <w:sz w:val="24"/>
-        </w:rPr>
-        <w:t>Center for Audit Quality. (2024). Audit committee transparency barometer. Washington, DC: CAQ.</w:t>
-      </w:r>
-    </w:p>
-    <w:p>
-      <w:pPr>
-        <w:spacing w:after="120" w:line="360" w:lineRule="auto"/>
-        <w:ind w:left="576" w:hanging="576"/>
-        <w:jc w:val="both"/>
-      </w:pPr>
-      <w:r>
-        <w:rPr>
-          <w:rFonts w:ascii="Times New Roman" w:hAnsi="Times New Roman"/>
-          <w:sz w:val="24"/>
-        </w:rPr>
-        <w:t>Central Bank of Kenya. (2024). Bank supervision annual report. Nairobi: Central Bank of Kenya.</w:t>
-      </w:r>
-    </w:p>
-    <w:p>
-      <w:pPr>
-        <w:spacing w:after="120" w:line="360" w:lineRule="auto"/>
-        <w:ind w:left="576" w:hanging="576"/>
-        <w:jc w:val="both"/>
-      </w:pPr>
-      <w:r>
-        <w:rPr>
-          <w:rFonts w:ascii="Times New Roman" w:hAnsi="Times New Roman"/>
-          <w:sz w:val="24"/>
-        </w:rPr>
-        <w:t>Chaudhry, N. I., Roomi, M. A., &amp; Aftab, I. (2020). Impact of expertise of audit committee chair and nomination committee chair on financial performance of firms. Corporate Governance, 20(4), 621–638.</w:t>
-      </w:r>
-    </w:p>
-    <w:p>
-      <w:pPr>
-        <w:spacing w:after="120" w:line="360" w:lineRule="auto"/>
-        <w:ind w:left="576" w:hanging="576"/>
-        <w:jc w:val="both"/>
-      </w:pPr>
-      <w:r>
-        <w:rPr>
-          <w:rFonts w:ascii="Times New Roman" w:hAnsi="Times New Roman"/>
-          <w:sz w:val="24"/>
-        </w:rPr>
-        <w:t>Deloitte. (2023). Audit committee resource guide. London: Deloitte.</w:t>
-      </w:r>
-    </w:p>
-    <w:p>
-      <w:pPr>
-        <w:spacing w:after="120" w:line="360" w:lineRule="auto"/>
-        <w:ind w:left="576" w:hanging="576"/>
-        <w:jc w:val="both"/>
-      </w:pPr>
-      <w:r>
-        <w:rPr>
-          <w:rFonts w:ascii="Times New Roman" w:hAnsi="Times New Roman"/>
-          <w:sz w:val="24"/>
-        </w:rPr>
-        <w:t>Deloitte. (2025). 2025 audit committee briefing: Emerging risks and oversight priorities. London: Deloitte.</w:t>
-      </w:r>
-    </w:p>
-    <w:p>
-      <w:pPr>
-        <w:spacing w:after="120" w:line="360" w:lineRule="auto"/>
-        <w:ind w:left="576" w:hanging="576"/>
-        <w:jc w:val="both"/>
-      </w:pPr>
-      <w:r>
-        <w:rPr>
-          <w:rFonts w:ascii="Times New Roman" w:hAnsi="Times New Roman"/>
-          <w:sz w:val="24"/>
-        </w:rPr>
-        <w:t>Donaldson, L., &amp; Davis, J. H. (1991). Stewardship theory or agency theory: CEO governance and shareholder returns. Australian Journal of Management, 16(1), 49–64.</w:t>
-      </w:r>
-    </w:p>
-    <w:p>
-      <w:pPr>
-        <w:spacing w:after="120" w:line="360" w:lineRule="auto"/>
-        <w:ind w:left="576" w:hanging="576"/>
-        <w:jc w:val="both"/>
-      </w:pPr>
-      <w:r>
-        <w:rPr>
-          <w:rFonts w:ascii="Times New Roman" w:hAnsi="Times New Roman"/>
-          <w:sz w:val="24"/>
-        </w:rPr>
-        <w:t>Elahi, M. (2025). Audit committee independence and bank systemic risk: Cross-country evidence. Journal of Banking Regulation, 26(2), 145–167.</w:t>
-      </w:r>
-    </w:p>
-    <w:p>
-      <w:pPr>
-        <w:spacing w:after="120" w:line="360" w:lineRule="auto"/>
-        <w:ind w:left="576" w:hanging="576"/>
-        <w:jc w:val="both"/>
-      </w:pPr>
-      <w:r>
-        <w:rPr>
-          <w:rFonts w:ascii="Times New Roman" w:hAnsi="Times New Roman"/>
-          <w:sz w:val="24"/>
-        </w:rPr>
-        <w:t>Freeman, R. E. (1984). Strategic management: A stakeholder approach. Boston: Pitman.</w:t>
-      </w:r>
-    </w:p>
-    <w:p>
-      <w:pPr>
-        <w:spacing w:after="120" w:line="360" w:lineRule="auto"/>
-        <w:ind w:left="576" w:hanging="576"/>
-        <w:jc w:val="both"/>
-      </w:pPr>
-      <w:r>
-        <w:rPr>
-          <w:rFonts w:ascii="Times New Roman" w:hAnsi="Times New Roman"/>
-          <w:sz w:val="24"/>
-        </w:rPr>
-        <w:t>Gordini, N., &amp; Rancati, E. (2017). Gender diversity in the Italian boardroom and firm financial performance. Management Research Review, 40(1), 75–94.</w:t>
-      </w:r>
-    </w:p>
-    <w:p>
-      <w:pPr>
-        <w:spacing w:after="120" w:line="360" w:lineRule="auto"/>
-        <w:ind w:left="576" w:hanging="576"/>
-        <w:jc w:val="both"/>
-      </w:pPr>
-      <w:r>
-        <w:rPr>
-          <w:rFonts w:ascii="Times New Roman" w:hAnsi="Times New Roman"/>
-          <w:sz w:val="24"/>
-        </w:rPr>
-        <w:t>Gupta, S. K., Sharma, A., &amp; Singh, K. (2022). Audit committee composition and the performance of Indian commercial banks. Indian Journal of Finance and Banking, 12(3), 45–67.</w:t>
-      </w:r>
-    </w:p>
-    <w:p>
-      <w:pPr>
-        <w:spacing w:after="120" w:line="360" w:lineRule="auto"/>
-        <w:ind w:left="576" w:hanging="576"/>
-        <w:jc w:val="both"/>
-      </w:pPr>
-      <w:r>
-        <w:rPr>
-          <w:rFonts w:ascii="Times New Roman" w:hAnsi="Times New Roman"/>
-          <w:sz w:val="24"/>
-        </w:rPr>
-        <w:t>Ibrahim, A., Habbash, M., &amp; Hussainey, K. (2019). Audit committee effectiveness and corporate disclosure: Evidence from Kenyan insurance companies. International Journal of Accounting, Auditing and Performance Evaluation, 15(2), 137–158.</w:t>
-      </w:r>
-    </w:p>
-    <w:p>
-      <w:pPr>
-        <w:spacing w:after="120" w:line="360" w:lineRule="auto"/>
-        <w:ind w:left="576" w:hanging="576"/>
-        <w:jc w:val="both"/>
-      </w:pPr>
-      <w:r>
-        <w:rPr>
-          <w:rFonts w:ascii="Times New Roman" w:hAnsi="Times New Roman"/>
-          <w:sz w:val="24"/>
-        </w:rPr>
-        <w:t>Institute of Directors in South Africa. (2021). King IV report on corporate governance for South Africa. Johannesburg: IoDSA.</w:t>
-      </w:r>
-    </w:p>
-    <w:p>
-      <w:pPr>
-        <w:spacing w:after="120" w:line="360" w:lineRule="auto"/>
-        <w:ind w:left="576" w:hanging="576"/>
-        <w:jc w:val="both"/>
-      </w:pPr>
-      <w:r>
-        <w:rPr>
-          <w:rFonts w:ascii="Times New Roman" w:hAnsi="Times New Roman"/>
-          <w:sz w:val="24"/>
-        </w:rPr>
-        <w:t>Jensen, M. C., &amp; Meckling, W. H. (1976). Theory of the firm: Managerial behaviour, agency costs and ownership structure. Journal of Financial Economics, 3(4), 305–360.</w:t>
-      </w:r>
-    </w:p>
-    <w:p>
-      <w:pPr>
-        <w:spacing w:after="120" w:line="360" w:lineRule="auto"/>
-        <w:ind w:left="576" w:hanging="576"/>
-        <w:jc w:val="both"/>
-      </w:pPr>
-      <w:r>
-        <w:rPr>
-          <w:rFonts w:ascii="Times New Roman" w:hAnsi="Times New Roman"/>
-          <w:sz w:val="24"/>
-        </w:rPr>
-        <w:t>Jonathan, M., &amp; Magoma, P. (2025). Audit committee leadership and ROA in Kenyan listed financial firms. African Journal of Finance and Management, 11(1), 22–41.</w:t>
-      </w:r>
-    </w:p>
-    <w:p>
-      <w:pPr>
-        <w:spacing w:after="120" w:line="360" w:lineRule="auto"/>
-        <w:ind w:left="576" w:hanging="576"/>
-        <w:jc w:val="both"/>
-      </w:pPr>
-      <w:r>
-        <w:rPr>
-          <w:rFonts w:ascii="Times New Roman" w:hAnsi="Times New Roman"/>
-          <w:sz w:val="24"/>
-        </w:rPr>
-        <w:t>Kallamu, B. S., &amp; Saat, N. A. M. (2015). Audit committee attributes and firm performance: Evidence from Malaysian finance companies. Asian Review of Accounting, 23(3), 206–231.</w:t>
-      </w:r>
-    </w:p>
-    <w:p>
-      <w:pPr>
-        <w:spacing w:after="120" w:line="360" w:lineRule="auto"/>
-        <w:ind w:left="576" w:hanging="576"/>
-        <w:jc w:val="both"/>
-      </w:pPr>
-      <w:r>
-        <w:rPr>
-          <w:rFonts w:ascii="Times New Roman" w:hAnsi="Times New Roman"/>
-          <w:sz w:val="24"/>
-        </w:rPr>
-        <w:t>Kapkiyai, C. C., Bonuke, R., &amp; Tarus, D. (2020). Audit committee characteristics and earnings management: A study of listed firms in Kenya. African Journal of Business Management, 14(5), 130–140.</w:t>
-      </w:r>
-    </w:p>
-    <w:p>
-      <w:pPr>
-        <w:spacing w:after="120" w:line="360" w:lineRule="auto"/>
-        <w:ind w:left="576" w:hanging="576"/>
-        <w:jc w:val="both"/>
-      </w:pPr>
-      <w:r>
-        <w:rPr>
-          <w:rFonts w:ascii="Times New Roman" w:hAnsi="Times New Roman"/>
-          <w:sz w:val="24"/>
-        </w:rPr>
-        <w:t>Karim, M. (2024). Audit committee characteristics and the firm performance of commercial banks in Bangladesh. Asian Journal of Accounting and Governance, 21(1), 1–18.</w:t>
-      </w:r>
-    </w:p>
-    <w:p>
-      <w:pPr>
-        <w:spacing w:after="120" w:line="360" w:lineRule="auto"/>
-        <w:ind w:left="576" w:hanging="576"/>
-        <w:jc w:val="both"/>
-      </w:pPr>
-      <w:r>
-        <w:rPr>
-          <w:rFonts w:ascii="Times New Roman" w:hAnsi="Times New Roman"/>
-          <w:sz w:val="24"/>
-        </w:rPr>
-        <w:t>Kenya Bankers Association. (2023). Annual industry performance report. Nairobi: Kenya Bankers Association.</w:t>
-      </w:r>
-    </w:p>
-    <w:p>
-      <w:pPr>
-        <w:spacing w:after="120" w:line="360" w:lineRule="auto"/>
-        <w:ind w:left="576" w:hanging="576"/>
-        <w:jc w:val="both"/>
-      </w:pPr>
-      <w:r>
-        <w:rPr>
-          <w:rFonts w:ascii="Times New Roman" w:hAnsi="Times New Roman"/>
-          <w:sz w:val="24"/>
-        </w:rPr>
-        <w:t>Kılıç, M., &amp; Kuzey, C. (2016). The effect of board gender diversity on firm performance: Evidence from Turkey. Gender in Management, 31(7), 434–455.</w:t>
-      </w:r>
-    </w:p>
-    <w:p>
-      <w:pPr>
-        <w:spacing w:after="120" w:line="360" w:lineRule="auto"/>
-        <w:ind w:left="576" w:hanging="576"/>
-        <w:jc w:val="both"/>
-      </w:pPr>
-      <w:r>
-        <w:rPr>
-          <w:rFonts w:ascii="Times New Roman" w:hAnsi="Times New Roman"/>
-          <w:sz w:val="24"/>
-        </w:rPr>
-        <w:t>Kipkoech, S. K., &amp; Rono, L. (2016). Audit committee size, experience and firm financial performance: Evidence from Nairobi Securities Exchange. Research Journal of Finance and Accounting, 7(15), 87–95.</w:t>
-      </w:r>
-    </w:p>
-    <w:p>
-      <w:pPr>
-        <w:spacing w:after="120" w:line="360" w:lineRule="auto"/>
-        <w:ind w:left="576" w:hanging="576"/>
-        <w:jc w:val="both"/>
-      </w:pPr>
-      <w:r>
-        <w:rPr>
-          <w:rFonts w:ascii="Times New Roman" w:hAnsi="Times New Roman"/>
-          <w:sz w:val="24"/>
-        </w:rPr>
-        <w:t>KPMG. (2021). Audit committee handbook. Amstelveen: KPMG International.</w:t>
-      </w:r>
-    </w:p>
-    <w:p>
-      <w:pPr>
-        <w:spacing w:after="120" w:line="360" w:lineRule="auto"/>
-        <w:ind w:left="576" w:hanging="576"/>
-        <w:jc w:val="both"/>
-      </w:pPr>
-      <w:r>
-        <w:rPr>
-          <w:rFonts w:ascii="Times New Roman" w:hAnsi="Times New Roman"/>
-          <w:sz w:val="24"/>
-        </w:rPr>
-        <w:t>KPMG. (2023). Effective audit committees: Insights from the boardroom. Amstelveen: KPMG International.</w:t>
-      </w:r>
-    </w:p>
-    <w:p>
-      <w:pPr>
-        <w:spacing w:after="120" w:line="360" w:lineRule="auto"/>
-        <w:ind w:left="576" w:hanging="576"/>
-        <w:jc w:val="both"/>
-      </w:pPr>
-      <w:r>
-        <w:rPr>
-          <w:rFonts w:ascii="Times New Roman" w:hAnsi="Times New Roman"/>
-          <w:sz w:val="24"/>
-        </w:rPr>
-        <w:t>Mohamed, A. M., &amp; Mwengei, K. B. O. (2019). Influence of audit committee independence on firm value of listed firms in Kenya. International Journal of Economics, Commerce and Management, 7(4), 462–478.</w:t>
-      </w:r>
-    </w:p>
-    <w:p>
-      <w:pPr>
-        <w:spacing w:after="120" w:line="360" w:lineRule="auto"/>
-        <w:ind w:left="576" w:hanging="576"/>
-        <w:jc w:val="both"/>
-      </w:pPr>
-      <w:r>
-        <w:rPr>
-          <w:rFonts w:ascii="Times New Roman" w:hAnsi="Times New Roman"/>
-          <w:sz w:val="24"/>
-        </w:rPr>
-        <w:t>Musallam, S. R. M. (2020). Effects of board characteristics, audit committee and risk management on firm performance: Evidence from listed firms in Palestine. Journal of Financial Reporting and Accounting, 18(4), 681–695.</w:t>
-      </w:r>
-    </w:p>
-    <w:p>
-      <w:pPr>
-        <w:spacing w:after="120" w:line="360" w:lineRule="auto"/>
-        <w:ind w:left="576" w:hanging="576"/>
-        <w:jc w:val="both"/>
-      </w:pPr>
-      <w:r>
-        <w:rPr>
-          <w:rFonts w:ascii="Times New Roman" w:hAnsi="Times New Roman"/>
-          <w:sz w:val="24"/>
-        </w:rPr>
-        <w:t>OECD. (2020). OECD principles of corporate governance. Paris: Organisation for Economic Co-operation and Development.</w:t>
-      </w:r>
-    </w:p>
-    <w:p>
-      <w:pPr>
-        <w:spacing w:after="120" w:line="360" w:lineRule="auto"/>
-        <w:ind w:left="576" w:hanging="576"/>
-        <w:jc w:val="both"/>
-      </w:pPr>
-      <w:r>
-        <w:rPr>
-          <w:rFonts w:ascii="Times New Roman" w:hAnsi="Times New Roman"/>
-          <w:sz w:val="24"/>
-        </w:rPr>
-        <w:t>Ofoeda, I. (2017). Corporate governance and non-bank financial institutions profitability. International Journal of Law and Management, 59(6), 854–875.</w:t>
-      </w:r>
-    </w:p>
-    <w:p>
-      <w:pPr>
-        <w:spacing w:after="120" w:line="360" w:lineRule="auto"/>
-        <w:ind w:left="576" w:hanging="576"/>
-        <w:jc w:val="both"/>
-      </w:pPr>
-      <w:r>
-        <w:rPr>
-          <w:rFonts w:ascii="Times New Roman" w:hAnsi="Times New Roman"/>
-          <w:sz w:val="24"/>
-        </w:rPr>
-        <w:t>Orjinta, H. I., &amp; Nkem, O. E. (2018). Audit committee characteristics and performance of non-financial firms: Evidence from emerging economy. International Journal of Innovative Research and Advanced Studies, 5(4), 39–46.</w:t>
-      </w:r>
-    </w:p>
-    <w:p>
-      <w:pPr>
-        <w:spacing w:after="120" w:line="360" w:lineRule="auto"/>
-        <w:ind w:left="576" w:hanging="576"/>
-        <w:jc w:val="both"/>
-      </w:pPr>
-      <w:r>
-        <w:rPr>
-          <w:rFonts w:ascii="Times New Roman" w:hAnsi="Times New Roman"/>
-          <w:sz w:val="24"/>
-        </w:rPr>
         <w:t>Oroud, Y. (2019). The effect of audit committee characteristics on the profitability: Panel data evidence. International Journal of Economics and Finance, 11(4), 104–112.</w:t>
-      </w:r>
-    </w:p>
-    <w:p>
-      <w:pPr>
-        <w:spacing w:after="120" w:line="360" w:lineRule="auto"/>
-        <w:ind w:left="576" w:hanging="576"/>
-        <w:jc w:val="both"/>
-      </w:pPr>
-      <w:r>
-        <w:rPr>
-          <w:rFonts w:ascii="Times New Roman" w:hAnsi="Times New Roman"/>
-          <w:sz w:val="24"/>
-        </w:rPr>
-        <w:t>Oussii, A. A., &amp; Taktak, N. B. (2018). Audit committee effectiveness and financial reporting timeliness: The case of Tunisian listed companies. African Journal of Economic and Management Studies, 9(1), 34–55.</w:t>
-      </w:r>
-    </w:p>
-    <w:p>
-      <w:pPr>
-        <w:spacing w:after="120" w:line="360" w:lineRule="auto"/>
-        <w:ind w:left="576" w:hanging="576"/>
-        <w:jc w:val="both"/>
-      </w:pPr>
-      <w:r>
-        <w:rPr>
-          <w:rFonts w:ascii="Times New Roman" w:hAnsi="Times New Roman"/>
-          <w:sz w:val="24"/>
-        </w:rPr>
-        <w:t>Pfeffer, J., &amp; Salancik, G. R. (1978). The external control of organisations: A resource dependence perspective. New York: Harper &amp; Row.</w:t>
-      </w:r>
-    </w:p>
-    <w:p>
-      <w:pPr>
-        <w:spacing w:after="120" w:line="360" w:lineRule="auto"/>
-        <w:ind w:left="576" w:hanging="576"/>
-        <w:jc w:val="both"/>
-      </w:pPr>
-      <w:r>
-        <w:rPr>
-          <w:rFonts w:ascii="Times New Roman" w:hAnsi="Times New Roman"/>
-          <w:sz w:val="24"/>
-        </w:rPr>
-        <w:t>Reuters. (2024). China tightens audit oversight after major financial scandals. Reuters Newswire, March 2024.</w:t>
-      </w:r>
-    </w:p>
-    <w:p>
-      <w:pPr>
-        <w:spacing w:after="120" w:line="360" w:lineRule="auto"/>
-        <w:ind w:left="576" w:hanging="576"/>
-        <w:jc w:val="both"/>
-      </w:pPr>
-      <w:r>
-        <w:rPr>
-          <w:rFonts w:ascii="Times New Roman" w:hAnsi="Times New Roman"/>
-          <w:sz w:val="24"/>
-        </w:rPr>
-        <w:t>Salehi, M., Tahervafaei, M., &amp; Tarighi, H. (2018). The effect of characteristics of audit committee and board on corporate profitability in Iran. Journal of Economic and Administrative Sciences, 34(1), 71–88.</w:t>
-      </w:r>
-    </w:p>
-    <w:p>
-      <w:pPr>
-        <w:spacing w:after="120" w:line="360" w:lineRule="auto"/>
-        <w:ind w:left="576" w:hanging="576"/>
-        <w:jc w:val="both"/>
-      </w:pPr>
-      <w:r>
-        <w:rPr>
-          <w:rFonts w:ascii="Times New Roman" w:hAnsi="Times New Roman"/>
-          <w:sz w:val="24"/>
-        </w:rPr>
-        <w:t>Singhania, M. (2025). Audit committee composition and firm performance in listed firms. Corporate Governance Review, 19(2), 88–106.</w:t>
-      </w:r>
-    </w:p>
-    <w:p>
-      <w:pPr>
-        <w:spacing w:after="120" w:line="360" w:lineRule="auto"/>
-        <w:ind w:left="576" w:hanging="576"/>
-        <w:jc w:val="both"/>
-      </w:pPr>
-      <w:r>
-        <w:rPr>
-          <w:rFonts w:ascii="Times New Roman" w:hAnsi="Times New Roman"/>
-          <w:sz w:val="24"/>
-        </w:rPr>
-        <w:t>World Bank. (2022). Global financial development report: Banks and capital markets in emerging economies. Washington, DC: World Bank.</w:t>
-      </w:r>
-    </w:p>
-    <w:p>
-      <w:pPr>
-        <w:spacing w:after="120" w:line="360" w:lineRule="auto"/>
-        <w:ind w:left="576" w:hanging="576"/>
-        <w:jc w:val="both"/>
-      </w:pPr>
-      <w:r>
-        <w:rPr>
-          <w:rFonts w:ascii="Times New Roman" w:hAnsi="Times New Roman"/>
-          <w:sz w:val="24"/>
-        </w:rPr>
-        <w:t>Yip, A. (2023). Audit committee effectiveness and reporting quality of Chinese listed firms. China Accounting and Finance Review, 25(3), 410–432.</w:t>
       </w:r>
       <w:r>
         <w:br w:type="page"/>
@@ -17229,6 +16711,7 @@
       <w:pgMar w:top="1440" w:right="1440" w:bottom="1440" w:left="1800" w:header="720" w:footer="720" w:gutter="0"/>
       <w:cols w:space="720"/>
       <w:docGrid w:linePitch="360"/>
+      <w:pgNumType w:fmt="decimal" w:start="1"/>
     </w:sectPr>
   </w:body>
 </w:document>
@@ -17242,6 +16725,10 @@
       <w:jc w:val="center"/>
     </w:pPr>
     <w:r>
+      <w:rPr>
+        <w:rFonts w:ascii="Times New Roman" w:hAnsi="Times New Roman"/>
+        <w:sz w:val="22"/>
+      </w:rPr>
       <w:fldChar w:fldCharType="begin"/>
       <w:instrText>PAGE</w:instrText>
       <w:fldChar w:fldCharType="end"/>

</xml_diff>

<commit_message>
Faith: front matter starts at i on DECLARATION (cover excluded from numbering)
</commit_message>
<xml_diff>
--- a/files/Faith_Okumu_Research_Project.docx
+++ b/files/Faith_Okumu_Research_Project.docx
@@ -629,7 +629,7 @@
           <w:sz w:val="22"/>
         </w:rPr>
         <w:tab/>
-        <w:t>ii</w:t>
+        <w:t>i</w:t>
       </w:r>
     </w:p>
     <w:p>
@@ -656,7 +656,7 @@
           <w:sz w:val="22"/>
         </w:rPr>
         <w:tab/>
-        <w:t>iii</w:t>
+        <w:t>ii</w:t>
       </w:r>
     </w:p>
     <w:p>
@@ -683,7 +683,7 @@
           <w:sz w:val="22"/>
         </w:rPr>
         <w:tab/>
-        <w:t>iv</w:t>
+        <w:t>iii</w:t>
       </w:r>
     </w:p>
     <w:p>
@@ -710,7 +710,7 @@
           <w:sz w:val="22"/>
         </w:rPr>
         <w:tab/>
-        <w:t>v</w:t>
+        <w:t>iv</w:t>
       </w:r>
     </w:p>
     <w:p>
@@ -737,7 +737,7 @@
           <w:sz w:val="22"/>
         </w:rPr>
         <w:tab/>
-        <w:t>vii</w:t>
+        <w:t>vi</w:t>
       </w:r>
     </w:p>
     <w:p>
@@ -764,7 +764,7 @@
           <w:sz w:val="22"/>
         </w:rPr>
         <w:tab/>
-        <w:t>ix</w:t>
+        <w:t>viii</w:t>
       </w:r>
     </w:p>
     <w:p>
@@ -791,7 +791,7 @@
           <w:sz w:val="22"/>
         </w:rPr>
         <w:tab/>
-        <w:t>x</w:t>
+        <w:t>ix</w:t>
       </w:r>
     </w:p>
     <w:p>
@@ -818,7 +818,7 @@
           <w:sz w:val="22"/>
         </w:rPr>
         <w:tab/>
-        <w:t>xi</w:t>
+        <w:t>x</w:t>
       </w:r>
     </w:p>
     <w:p>
@@ -2904,7 +2904,7 @@
       <w:pPr>
         <w:sectPr>
           <w:type w:val="nextPage"/>
-          <w:pgNumType w:fmt="lowerRoman" w:start="2"/>
+          <w:pgNumType w:fmt="lowerRoman" w:start="1"/>
         </w:sectPr>
       </w:pPr>
     </w:p>

</xml_diff>